<commit_message>
Correction de tel bug
</commit_message>
<xml_diff>
--- a/Calcul.docx
+++ b/Calcul.docx
@@ -13,6 +13,16 @@
           <w:szCs w:val="48"/>
         </w:rPr>
       </w:pPr>
+      <w:r>
+        <w:rPr>
+          <w:b/>
+          <w:bCs/>
+          <w:color w:val="C00000"/>
+          <w:sz w:val="48"/>
+          <w:szCs w:val="48"/>
+        </w:rPr>
+        <w:t xml:space="preserve">La dernière val </w:t>
+      </w:r>
       <w:r>
         <w:rPr>
           <w:b/>
@@ -721,6 +731,7 @@
           <w:b/>
           <w:bCs/>
         </w:rPr>
+        <w:lastRenderedPageBreak/>
         <w:t>La LAA couvre les accidents professionnels et non professionnels.</w:t>
       </w:r>
     </w:p>
@@ -737,7 +748,6 @@
           <w:b/>
           <w:bCs/>
         </w:rPr>
-        <w:lastRenderedPageBreak/>
         <w:t>Répartition :</w:t>
       </w:r>
     </w:p>
@@ -1064,7 +1074,7 @@
           <w:bCs/>
         </w:rPr>
         <w:pict w14:anchorId="5835A064">
-          <v:rect id="_x0000_i1049" style="width:0;height:0" o:hralign="center" o:hrstd="t" o:hr="t" fillcolor="#a0a0a0" stroked="f"/>
+          <v:rect id="_x0000_i1025" style="width:0;height:0" o:hralign="center" o:hrstd="t" o:hr="t" fillcolor="#a0a0a0" stroked="f"/>
         </w:pict>
       </w:r>
     </w:p>
@@ -1684,7 +1694,7 @@
           <w:bCs/>
         </w:rPr>
         <w:pict w14:anchorId="1C56F08D">
-          <v:rect id="_x0000_i1050" style="width:0;height:0" o:hralign="center" o:hrstd="t" o:hr="t" fillcolor="#a0a0a0" stroked="f"/>
+          <v:rect id="_x0000_i1026" style="width:0;height:0" o:hralign="center" o:hrstd="t" o:hr="t" fillcolor="#a0a0a0" stroked="f"/>
         </w:pict>
       </w:r>
     </w:p>
@@ -1803,7 +1813,7 @@
           <w:bCs/>
         </w:rPr>
         <w:pict w14:anchorId="4E570AFE">
-          <v:rect id="_x0000_i1051" style="width:0;height:0" o:hralign="center" o:hrstd="t" o:hr="t" fillcolor="#a0a0a0" stroked="f"/>
+          <v:rect id="_x0000_i1027" style="width:0;height:0" o:hralign="center" o:hrstd="t" o:hr="t" fillcolor="#a0a0a0" stroked="f"/>
         </w:pict>
       </w:r>
     </w:p>
@@ -2361,7 +2371,7 @@
           <w:bCs/>
         </w:rPr>
         <w:pict w14:anchorId="7C4D8DD5">
-          <v:rect id="_x0000_i1052" style="width:0;height:0" o:hralign="center" o:hrstd="t" o:hr="t" fillcolor="#a0a0a0" stroked="f"/>
+          <v:rect id="_x0000_i1028" style="width:0;height:0" o:hralign="center" o:hrstd="t" o:hr="t" fillcolor="#a0a0a0" stroked="f"/>
         </w:pict>
       </w:r>
     </w:p>
@@ -5272,6 +5282,7 @@
   <w:style w:type="character" w:default="1" w:styleId="Policepardfaut">
     <w:name w:val="Default Paragraph Font"/>
     <w:uiPriority w:val="1"/>
+    <w:semiHidden/>
     <w:unhideWhenUsed/>
   </w:style>
   <w:style w:type="table" w:default="1" w:styleId="TableauNormal">

</xml_diff>